<commit_message>
Build code finished. WOrking on summary statistics and write up.
</commit_message>
<xml_diff>
--- a/Paper/Paper.docx
+++ b/Paper/Paper.docx
@@ -123,27 +123,20 @@
       </w:r>
     </w:p>
     <w:p>
-      <w:proofErr w:type="spellStart"/>
-      <w:r>
-        <w:t>Theorteical</w:t>
-      </w:r>
-      <w:proofErr w:type="spellEnd"/>
-      <w:r>
-        <w:t xml:space="preserve"> modeling of how institutional investors may impact the welfare of cities and renters.</w:t>
-      </w:r>
-    </w:p>
-    <w:p>
-      <w:proofErr w:type="spellStart"/>
-      <w:r>
-        <w:t>Esitmates</w:t>
-      </w:r>
-      <w:proofErr w:type="spellEnd"/>
-      <w:r>
-        <w:t xml:space="preserve"> of how opportunity zone designation impact the value of homes within that census tract. </w:t>
+      <w:r>
+        <w:t>Theorteical modeling of how institutional investors may impact the welfare of cities and renters.</w:t>
+      </w:r>
+    </w:p>
+    <w:p>
+      <w:r>
+        <w:t xml:space="preserve">Esitmates of how opportunity zone designation impact the value of homes within that census tract. </w:t>
       </w:r>
     </w:p>
     <w:p/>
     <w:p>
+      <w:pPr>
+        <w:pStyle w:val="Heading2"/>
+      </w:pPr>
       <w:r>
         <w:t>Data</w:t>
       </w:r>
@@ -154,6 +147,9 @@
       </w:r>
     </w:p>
     <w:p>
+      <w:pPr>
+        <w:pStyle w:val="Heading3"/>
+      </w:pPr>
       <w:r>
         <w:t>Ownership Data</w:t>
       </w:r>
@@ -201,22 +197,31 @@
         <w:t xml:space="preserve"> name, the parcel was classified as corporate or if “Bank” was in the owner name, the parcel was classified as REO. </w:t>
       </w:r>
       <w:r>
-        <w:t xml:space="preserve">Any property that was not classified using these obvious terms, was then visually searched for other terms such as spelling variations or other indicators that would indicate the type of owner for each parcel. </w:t>
-      </w:r>
-    </w:p>
-    <w:p/>
+        <w:t xml:space="preserve">Any property that </w:t>
+      </w:r>
+      <w:r>
+        <w:lastRenderedPageBreak/>
+        <w:t xml:space="preserve">was not classified using these obvious terms, was then visually searched for other terms such as spelling variations or other indicators that would indicate the type of owner for each parcel. </w:t>
+      </w:r>
+    </w:p>
     <w:p>
       <w:r>
         <w:t xml:space="preserve">By the end of the process, there were eight categories of ownership types that were identified and into which each parcel was classified. Those categories and the share of the entire sample of parcels across the 2011 to 2023 timeframe are shown in the table below. Any parcel that was already classified as owner occupied based on the address comparison were automatically classified as privately owned. </w:t>
       </w:r>
-    </w:p>
-    <w:p>
+      <w:r>
+        <w:t xml:space="preserve">The table also shows how the property ownership categories differ by land use class where multi-use properties are aggregated to the “Multi” land use class. </w:t>
+      </w:r>
+    </w:p>
+    <w:p>
+      <w:pPr>
+        <w:jc w:val="center"/>
+      </w:pPr>
       <w:r>
         <w:drawing>
-          <wp:inline distT="0" distB="0" distL="0" distR="0" wp14:anchorId="07A25D81" wp14:editId="2DCA5D0C">
-            <wp:extent cx="5943600" cy="3707765"/>
-            <wp:effectExtent l="0" t="0" r="0" b="6985"/>
-            <wp:docPr id="1675225348" name="Picture 1"/>
+          <wp:inline distT="0" distB="0" distL="0" distR="0" wp14:anchorId="06B4570C" wp14:editId="4FBF4745">
+            <wp:extent cx="5257800" cy="4829199"/>
+            <wp:effectExtent l="0" t="0" r="0" b="9525"/>
+            <wp:docPr id="1715375020" name="Picture 1"/>
             <wp:cNvGraphicFramePr>
               <a:graphicFrameLocks xmlns:a="http://schemas.openxmlformats.org/drawingml/2006/main" noChangeAspect="1"/>
             </wp:cNvGraphicFramePr>
@@ -224,11 +229,11 @@
               <a:graphicData uri="http://schemas.openxmlformats.org/drawingml/2006/picture">
                 <pic:pic xmlns:pic="http://schemas.openxmlformats.org/drawingml/2006/picture">
                   <pic:nvPicPr>
-                    <pic:cNvPr id="1675225348" name=""/>
+                    <pic:cNvPr id="1715375020" name=""/>
                     <pic:cNvPicPr/>
                   </pic:nvPicPr>
                   <pic:blipFill>
-                    <a:blip r:embed="rId4"/>
+                    <a:blip r:embed="rId7"/>
                     <a:stretch>
                       <a:fillRect/>
                     </a:stretch>
@@ -236,7 +241,7 @@
                   <pic:spPr>
                     <a:xfrm>
                       <a:off x="0" y="0"/>
-                      <a:ext cx="5943600" cy="3707765"/>
+                      <a:ext cx="5257800" cy="4829199"/>
                     </a:xfrm>
                     <a:prstGeom prst="rect">
                       <a:avLst/>
@@ -253,8 +258,83 @@
       <w:r>
         <w:t xml:space="preserve">Of the almost 5.7 million residential parcels across the timeframe, seventy-seven (77%) percent are classified as owner occupied contributing to the eighty-seven (87%) percent of parcels that are privately owned. Just over seven percent (7.3%) are owned by a corporate entity with trustees accounting for the next largest share at 3.8%, followed by partnerships at 1.8%. </w:t>
       </w:r>
-    </w:p>
-    <w:p>
+      <w:r>
+        <w:t>To help simplify the analysis we combine the trustee and partnership categories into a new category called “legal” and combine the nonprofit, reown, hoa, and muni categories into the “other” category.</w:t>
+      </w:r>
+    </w:p>
+    <w:p>
+      <w:r>
+        <w:t xml:space="preserve">Figure 1 shows the share of parcels with ownership type equal to the corporate, legal, and other categories (the remaining share is private). </w:t>
+      </w:r>
+      <w:r>
+        <w:t>Parcels</w:t>
+      </w:r>
+      <w:r>
+        <w:t xml:space="preserve"> in the other category make up a rather constant </w:t>
+      </w:r>
+      <w:r>
+        <w:lastRenderedPageBreak/>
+        <w:t xml:space="preserve">share across the years at around 2.5%. Parcels in the “legal” category see a slight increase in share across the years ranging from about 4.8% to a high of 6.3 percent of the total parcels within the county. </w:t>
+      </w:r>
+      <w:r>
+        <w:t>The</w:t>
+      </w:r>
+      <w:r>
+        <w:t xml:space="preserve"> image </w:t>
+      </w:r>
+      <w:r>
+        <w:t>clearly shows t</w:t>
+      </w:r>
+      <w:r>
+        <w:t>he increasing share of corporate own parcels across the years as the share of corporate owned parcels almost doubles from about 6.6% in 2010 to a high of 11.6% by 2024.</w:t>
+      </w:r>
+    </w:p>
+    <w:p>
+      <w:pPr>
+        <w:jc w:val="center"/>
+      </w:pPr>
+      <w:r>
+        <w:drawing>
+          <wp:inline distT="0" distB="0" distL="0" distR="0" wp14:anchorId="7BB702A4" wp14:editId="4275B789">
+            <wp:extent cx="5257800" cy="3510256"/>
+            <wp:effectExtent l="0" t="0" r="0" b="0"/>
+            <wp:docPr id="701064926" name="Picture 1"/>
+            <wp:cNvGraphicFramePr>
+              <a:graphicFrameLocks xmlns:a="http://schemas.openxmlformats.org/drawingml/2006/main" noChangeAspect="1"/>
+            </wp:cNvGraphicFramePr>
+            <a:graphic xmlns:a="http://schemas.openxmlformats.org/drawingml/2006/main">
+              <a:graphicData uri="http://schemas.openxmlformats.org/drawingml/2006/picture">
+                <pic:pic xmlns:pic="http://schemas.openxmlformats.org/drawingml/2006/picture">
+                  <pic:nvPicPr>
+                    <pic:cNvPr id="701064926" name=""/>
+                    <pic:cNvPicPr/>
+                  </pic:nvPicPr>
+                  <pic:blipFill>
+                    <a:blip r:embed="rId8"/>
+                    <a:stretch>
+                      <a:fillRect/>
+                    </a:stretch>
+                  </pic:blipFill>
+                  <pic:spPr>
+                    <a:xfrm>
+                      <a:off x="0" y="0"/>
+                      <a:ext cx="5257800" cy="3510256"/>
+                    </a:xfrm>
+                    <a:prstGeom prst="rect">
+                      <a:avLst/>
+                    </a:prstGeom>
+                  </pic:spPr>
+                </pic:pic>
+              </a:graphicData>
+            </a:graphic>
+          </wp:inline>
+        </w:drawing>
+      </w:r>
+    </w:p>
+    <w:p>
+      <w:pPr>
+        <w:pStyle w:val="Heading3"/>
+      </w:pPr>
       <w:r>
         <w:t>Sales Data</w:t>
       </w:r>
@@ -264,41 +344,501 @@
         <w:t>The county assessor’s office also tracks all property transactions within the county and maintains the core database of sales by adding any new data each year. Using the database as of 2024, we start with 930,889</w:t>
       </w:r>
       <w:r>
-        <w:t xml:space="preserve"> with some observations reaching back as far as the 1950’s. The further back in time one goes, however, the less reliable is the data and so we limit ourselves to the 2011 to 2023 timeframe. We also limit ourselves to only arm’s length valid transactions with a nominal sale price greater than $1,000 which brings our count down to 273,563 sales records. </w:t>
-      </w:r>
-    </w:p>
-    <w:p>
-      <w:r>
-        <w:t xml:space="preserve">We then link this data to the ownership data by joining on the parcel identification and the year prior to the sale and the year directly after the sale year reported in the sales database. This allows us to determine the owner type and tenure before and after the sale of the given parcel. By linking this to parts of the accessor’s database that contains more detailed information about the home, we can </w:t>
-      </w:r>
+        <w:t xml:space="preserve"> with some observations reaching back as far as the 1950’s. The further back in time one goes, however, the less reliable is the data and so we limit ourselves to the 2011 to 2023 timeframe. We also limit ourselves to only arm’s length valid transactions </w:t>
+      </w:r>
+      <w:r>
+        <w:t xml:space="preserve">of </w:t>
+      </w:r>
+      <w:r>
+        <w:t>single-family</w:t>
+      </w:r>
+      <w:r>
+        <w:t xml:space="preserve"> homes </w:t>
+      </w:r>
+      <w:r>
+        <w:t xml:space="preserve">with a nominal sale price greater than $1,000 which brings our </w:t>
+      </w:r>
+      <w:r>
+        <w:t xml:space="preserve">observation count </w:t>
+      </w:r>
+      <w:r>
+        <w:t xml:space="preserve">to 273,563 sales records. </w:t>
+      </w:r>
+    </w:p>
+    <w:p>
+      <w:r>
+        <w:t xml:space="preserve">We link this data to the ownership data by joining on the parcel identification and the year prior to the sale and the year directly after the sale year reported in the sales database. This allows us to determine the owner type and tenure before and after the sale of the given parcel. By linking this to parts of the accessor’s database that contains more detailed information about the home, we can classify homes that are sold by the builders and identify those units in the data. In cases of missing or conflicting information that we observe, we double check the ownership information using the property lookup feature hosted by the county assessor’s office on their website. We also remove any sale that has a real price above $2.5 million and then add a count for the number of times each parcel sells. These changes and removing properties with missing information results in a total of 143,300 </w:t>
+      </w:r>
+      <w:proofErr w:type="gramStart"/>
+      <w:r>
+        <w:t>sales records</w:t>
+      </w:r>
+      <w:proofErr w:type="gramEnd"/>
+      <w:r>
+        <w:t xml:space="preserve"> remaining to work with. </w:t>
+      </w:r>
+    </w:p>
+    <w:p>
       <w:r>
         <w:lastRenderedPageBreak/>
-        <w:t xml:space="preserve">classify homes that are sold by the builders and identify those units in the data. In cases of missing or conflicting information that we observe, we double check the ownership information using the property lookup feature hosted by the county assessor’s office on their website. We also remove any sale that has a real price above $2.5 million and then add a count for the number of times each parcel sells. These changes along with limiting ourselves to only residential properties and removing properties with missing information results in a total of 143,300 sales records remaining to work with. </w:t>
-      </w:r>
-    </w:p>
-    <w:p>
+        <w:t xml:space="preserve">The figure below shows the average real price of transactions from 2011 through 2024 for each of the four combinations of transaction tenure change. We see the largest growth in home values occur for the owner-to-owner transactions followed by the nonowner to owner type. This is expected as most literature indicates that owners occupied housing sales for a premium. Of note, however, is the strong showing and large gains in the owner to nonowner average real price, especially after 2018 when the more recent surge in corporate home buying started. Finally, transactions between </w:t>
+      </w:r>
+      <w:proofErr w:type="gramStart"/>
+      <w:r>
+        <w:t>nonowners</w:t>
+      </w:r>
+      <w:proofErr w:type="gramEnd"/>
+      <w:r>
+        <w:t xml:space="preserve"> see some small gains, but nothing significant indicates there are likely contributing factors behind these sales. </w:t>
+      </w:r>
+    </w:p>
+    <w:p>
+      <w:pPr>
+        <w:jc w:val="center"/>
+      </w:pPr>
+      <w:r>
+        <w:drawing>
+          <wp:inline distT="0" distB="0" distL="0" distR="0" wp14:anchorId="65C2830E" wp14:editId="520E50AF">
+            <wp:extent cx="5257800" cy="3219279"/>
+            <wp:effectExtent l="0" t="0" r="0" b="635"/>
+            <wp:docPr id="791639538" name="Picture 1"/>
+            <wp:cNvGraphicFramePr>
+              <a:graphicFrameLocks xmlns:a="http://schemas.openxmlformats.org/drawingml/2006/main" noChangeAspect="1"/>
+            </wp:cNvGraphicFramePr>
+            <a:graphic xmlns:a="http://schemas.openxmlformats.org/drawingml/2006/main">
+              <a:graphicData uri="http://schemas.openxmlformats.org/drawingml/2006/picture">
+                <pic:pic xmlns:pic="http://schemas.openxmlformats.org/drawingml/2006/picture">
+                  <pic:nvPicPr>
+                    <pic:cNvPr id="791639538" name=""/>
+                    <pic:cNvPicPr/>
+                  </pic:nvPicPr>
+                  <pic:blipFill>
+                    <a:blip r:embed="rId9"/>
+                    <a:stretch>
+                      <a:fillRect/>
+                    </a:stretch>
+                  </pic:blipFill>
+                  <pic:spPr>
+                    <a:xfrm>
+                      <a:off x="0" y="0"/>
+                      <a:ext cx="5257800" cy="3219279"/>
+                    </a:xfrm>
+                    <a:prstGeom prst="rect">
+                      <a:avLst/>
+                    </a:prstGeom>
+                  </pic:spPr>
+                </pic:pic>
+              </a:graphicData>
+            </a:graphic>
+          </wp:inline>
+        </w:drawing>
+      </w:r>
+    </w:p>
+    <w:p>
+      <w:r>
+        <w:t xml:space="preserve">The next figure shows how the average price </w:t>
+      </w:r>
+      <w:r>
+        <w:t>changes</w:t>
+      </w:r>
+      <w:r>
+        <w:t xml:space="preserve"> by the buyer type of the </w:t>
+      </w:r>
+      <w:r>
+        <w:t>year</w:t>
+      </w:r>
+      <w:r>
+        <w:t xml:space="preserve"> </w:t>
+      </w:r>
+      <w:proofErr w:type="gramStart"/>
+      <w:r>
+        <w:t>of</w:t>
+      </w:r>
+      <w:proofErr w:type="gramEnd"/>
+      <w:r>
+        <w:t xml:space="preserve"> the sample. What is of most interest in this figure is that the legal buyers seem to be increasing in price to almost that of private buyers while corporate buyers are not seeing </w:t>
+      </w:r>
+      <w:r>
+        <w:t xml:space="preserve">prices stay rather constant. </w:t>
+      </w:r>
+    </w:p>
+    <w:p/>
+    <w:p>
+      <w:r>
+        <w:t>Finally</w:t>
+      </w:r>
+      <w:r>
+        <w:t xml:space="preserve">, since we accept there are several unobserved factors that will complicate the analysis, we opt to </w:t>
+      </w:r>
+      <w:r>
+        <w:t xml:space="preserve">utilize a repeated sales approach so that unobservable factors that are constant can be </w:t>
+      </w:r>
+      <w:proofErr w:type="gramStart"/>
+      <w:r>
+        <w:t>differenced out of</w:t>
+      </w:r>
+      <w:proofErr w:type="gramEnd"/>
+      <w:r>
+        <w:t xml:space="preserve"> the data. While this method is not perfect, it does allow us to focus on the key effects we are looking for in our analysis. Therefore, we remove any parcel that is only sold once in the data and limit the sales to those that occur with at least one year between the sales and remove any cases where the sale took place between the builder of the unit and the first owner. This results in a dataset with 34,812 observations across the period from 2012 to 2023. </w:t>
+      </w:r>
+    </w:p>
+    <w:p>
+      <w:r>
+        <w:rPr>
+          <w:noProof/>
+        </w:rPr>
+        <w:lastRenderedPageBreak/>
+        <w:drawing>
+          <wp:inline distT="0" distB="0" distL="0" distR="0" wp14:anchorId="50D8E54F" wp14:editId="1F4C89EB">
+            <wp:extent cx="5695950" cy="5286375"/>
+            <wp:effectExtent l="0" t="0" r="0" b="9525"/>
+            <wp:docPr id="1040997241" name="Picture 1"/>
+            <wp:cNvGraphicFramePr>
+              <a:graphicFrameLocks xmlns:a="http://schemas.openxmlformats.org/drawingml/2006/main" noChangeAspect="1"/>
+            </wp:cNvGraphicFramePr>
+            <a:graphic xmlns:a="http://schemas.openxmlformats.org/drawingml/2006/main">
+              <a:graphicData uri="http://schemas.openxmlformats.org/drawingml/2006/picture">
+                <pic:pic xmlns:pic="http://schemas.openxmlformats.org/drawingml/2006/picture">
+                  <pic:nvPicPr>
+                    <pic:cNvPr id="0" name="Picture 1"/>
+                    <pic:cNvPicPr>
+                      <a:picLocks noChangeAspect="1" noChangeArrowheads="1"/>
+                    </pic:cNvPicPr>
+                  </pic:nvPicPr>
+                  <pic:blipFill>
+                    <a:blip r:embed="rId10">
+                      <a:extLst>
+                        <a:ext uri="{28A0092B-C50C-407E-A947-70E740481C1C}">
+                          <a14:useLocalDpi xmlns:a14="http://schemas.microsoft.com/office/drawing/2010/main" val="0"/>
+                        </a:ext>
+                      </a:extLst>
+                    </a:blip>
+                    <a:srcRect/>
+                    <a:stretch>
+                      <a:fillRect/>
+                    </a:stretch>
+                  </pic:blipFill>
+                  <pic:spPr bwMode="auto">
+                    <a:xfrm>
+                      <a:off x="0" y="0"/>
+                      <a:ext cx="5695950" cy="5286375"/>
+                    </a:xfrm>
+                    <a:prstGeom prst="rect">
+                      <a:avLst/>
+                    </a:prstGeom>
+                    <a:noFill/>
+                    <a:ln>
+                      <a:noFill/>
+                    </a:ln>
+                  </pic:spPr>
+                </pic:pic>
+              </a:graphicData>
+            </a:graphic>
+          </wp:inline>
+        </w:drawing>
+      </w:r>
+    </w:p>
+    <w:p>
+      <w:r>
+        <w:t xml:space="preserve">There are fewer sales during 2012 and </w:t>
+      </w:r>
+      <w:proofErr w:type="gramStart"/>
+      <w:r>
+        <w:t>2013</w:t>
+      </w:r>
+      <w:proofErr w:type="gramEnd"/>
+      <w:r>
+        <w:t xml:space="preserve"> and we see that prices are generally falling for those two years. Part of this is that there is a smaller time between sales since the ownership data only </w:t>
+      </w:r>
+      <w:proofErr w:type="gramStart"/>
+      <w:r>
+        <w:t>dates back to</w:t>
+      </w:r>
+      <w:proofErr w:type="gramEnd"/>
+      <w:r>
+        <w:t xml:space="preserve"> 2011 meaning that all sales in 2012 take place within one year. We will account for this issue by estimating two samples, one with these observations and one limiting the observations to fewer years to ensure the time to sale is not driving the results. On average, the time between sales is about 3.7 years with prices generally rising across the timeframe. </w:t>
+      </w:r>
+    </w:p>
+    <w:p/>
+    <w:p>
+      <w:r>
+        <w:t>By linking the ownership data to the sales data, we can determine how changes in price and time to sale change, if at all, based on the type of transaction</w:t>
+      </w:r>
+      <w:r>
+        <w:t xml:space="preserve"> and we tract the transaction between different types of owners. In the table below we see that 68% of all </w:t>
+      </w:r>
+      <w:proofErr w:type="gramStart"/>
+      <w:r>
+        <w:t>transaction occurs</w:t>
+      </w:r>
+      <w:proofErr w:type="gramEnd"/>
+      <w:r>
+        <w:t xml:space="preserve"> between two private agents which account for all the owner-to-owner transactions and about a third of the owner to </w:t>
+      </w:r>
+      <w:proofErr w:type="gramStart"/>
+      <w:r>
+        <w:t>nonowner</w:t>
+      </w:r>
+      <w:proofErr w:type="gramEnd"/>
+      <w:r>
+        <w:t xml:space="preserve"> and </w:t>
+      </w:r>
+      <w:proofErr w:type="gramStart"/>
+      <w:r>
+        <w:t>nonowner</w:t>
+      </w:r>
+      <w:proofErr w:type="gramEnd"/>
+      <w:r>
+        <w:t xml:space="preserve"> to owner transactions. Among the owners to nonowner sales, 40% are between a private owner to a corporate owner with another 26% being between private owners and legal owners such as trustees or partnerships. Conversely, among the nonowner to </w:t>
+      </w:r>
+      <w:r>
+        <w:lastRenderedPageBreak/>
+        <w:t>owner transactions, corporate to private owners account for 40% of this direction and 23% of the transactions are between legal agents and private owners. Most variation between types of owners occurs in the transactions between nonowner and other nonowners; however, a majority of these are private to private or some variation between corporate and private agents.</w:t>
+      </w:r>
+    </w:p>
+    <w:p>
+      <w:pPr>
+        <w:jc w:val="center"/>
+      </w:pPr>
+      <w:r>
+        <w:drawing>
+          <wp:inline distT="0" distB="0" distL="0" distR="0" wp14:anchorId="37738323" wp14:editId="7106FD07">
+            <wp:extent cx="5257800" cy="3467564"/>
+            <wp:effectExtent l="0" t="0" r="0" b="0"/>
+            <wp:docPr id="636747735" name="Picture 1"/>
+            <wp:cNvGraphicFramePr>
+              <a:graphicFrameLocks xmlns:a="http://schemas.openxmlformats.org/drawingml/2006/main" noChangeAspect="1"/>
+            </wp:cNvGraphicFramePr>
+            <a:graphic xmlns:a="http://schemas.openxmlformats.org/drawingml/2006/main">
+              <a:graphicData uri="http://schemas.openxmlformats.org/drawingml/2006/picture">
+                <pic:pic xmlns:pic="http://schemas.openxmlformats.org/drawingml/2006/picture">
+                  <pic:nvPicPr>
+                    <pic:cNvPr id="636747735" name=""/>
+                    <pic:cNvPicPr/>
+                  </pic:nvPicPr>
+                  <pic:blipFill>
+                    <a:blip r:embed="rId11"/>
+                    <a:stretch>
+                      <a:fillRect/>
+                    </a:stretch>
+                  </pic:blipFill>
+                  <pic:spPr>
+                    <a:xfrm>
+                      <a:off x="0" y="0"/>
+                      <a:ext cx="5257800" cy="3467564"/>
+                    </a:xfrm>
+                    <a:prstGeom prst="rect">
+                      <a:avLst/>
+                    </a:prstGeom>
+                  </pic:spPr>
+                </pic:pic>
+              </a:graphicData>
+            </a:graphic>
+          </wp:inline>
+        </w:drawing>
+      </w:r>
+    </w:p>
+    <w:p>
+      <w:r>
+        <w:t xml:space="preserve">Across the transfers we see that nonowner to nonowner and owner to nonowner see the smallest gains with between 2 and 3 years elapsing between sales. </w:t>
+      </w:r>
+      <w:r>
+        <w:t>Larger</w:t>
+      </w:r>
+      <w:r>
+        <w:t xml:space="preserve"> gains are seen in the owner to owner or the nonowner to owner transactions with </w:t>
+      </w:r>
+      <w:r>
+        <w:t>owner-to-owner</w:t>
+      </w:r>
+      <w:r>
+        <w:t xml:space="preserve"> transactions seeing the longest time between sales of four years. </w:t>
+      </w:r>
+    </w:p>
+    <w:p>
+      <w:pPr>
+        <w:pStyle w:val="Heading3"/>
+      </w:pPr>
       <w:r>
         <w:t>Neighborhoods</w:t>
       </w:r>
     </w:p>
     <w:p>
       <w:r>
-        <w:t>Since there is no exogenous definition for what a “neighborhood” is, we create buffers equal to one-quarter, one-half, and three-quarters of a mile around each of the sold residential properties. For simplicity, the buffers are center on the centroid of the sold parcel as defined by the “</w:t>
+        <w:t xml:space="preserve">The goal of this analysis is to determine how the price gains or losses are impacted, if at all, by changes in the neighborhood between sales. </w:t>
+      </w:r>
+      <w:r>
+        <w:t>Since there is no exogenous definition for what a “neighborhood” is, we create buffers equal to one-quarter, one-half, and three-quarters of a mile around each of the sold residential properties.</w:t>
+      </w:r>
+      <w:r>
+        <w:rPr>
+          <w:rStyle w:val="FootnoteReference"/>
+        </w:rPr>
+        <w:footnoteReference w:id="1"/>
+      </w:r>
+      <w:r>
+        <w:t xml:space="preserve"> We then intersect these buffer areas with a map of centroids for all parcels within the county to determine </w:t>
+      </w:r>
+      <w:r>
+        <w:t xml:space="preserve">the ownership characteristics of the parcels surrounding the sold units. </w:t>
+      </w:r>
+      <w:r>
+        <w:t xml:space="preserve"> </w:t>
+      </w:r>
+      <w:r>
+        <w:t xml:space="preserve">To measure how the neighborhood changes, we link the owner data for the parcels identified as a neighborhood for our transacted property in the year of the sale and calculate the share of the parcels in the defined neighborhood buffer that belong to the different ownership types and tenures. </w:t>
+      </w:r>
+    </w:p>
+    <w:p>
+      <w:r>
+        <w:t xml:space="preserve">Additionally, we link population characteristics downloaded from the ACS 5-year survey data at the tract level for each of the transacted properties. Once this data is linked to the parcels in their year </w:t>
+      </w:r>
+      <w:r>
+        <w:lastRenderedPageBreak/>
+        <w:t xml:space="preserve">of sale, we order the sales of a given parcel from oldest to most recent and then </w:t>
+      </w:r>
+      <w:r>
+        <w:t>different</w:t>
+      </w:r>
+      <w:r>
+        <w:t xml:space="preserve"> neighborhood and census measures used between sales. </w:t>
+      </w:r>
+    </w:p>
+    <w:p>
+      <w:pPr>
+        <w:jc w:val="center"/>
+      </w:pPr>
+      <w:r>
+        <w:drawing>
+          <wp:inline distT="0" distB="0" distL="0" distR="0" wp14:anchorId="0A20A823" wp14:editId="50A12613">
+            <wp:extent cx="5257800" cy="2751357"/>
+            <wp:effectExtent l="0" t="0" r="0" b="0"/>
+            <wp:docPr id="1756733117" name="Picture 1"/>
+            <wp:cNvGraphicFramePr>
+              <a:graphicFrameLocks xmlns:a="http://schemas.openxmlformats.org/drawingml/2006/main" noChangeAspect="1"/>
+            </wp:cNvGraphicFramePr>
+            <a:graphic xmlns:a="http://schemas.openxmlformats.org/drawingml/2006/main">
+              <a:graphicData uri="http://schemas.openxmlformats.org/drawingml/2006/picture">
+                <pic:pic xmlns:pic="http://schemas.openxmlformats.org/drawingml/2006/picture">
+                  <pic:nvPicPr>
+                    <pic:cNvPr id="1756733117" name=""/>
+                    <pic:cNvPicPr/>
+                  </pic:nvPicPr>
+                  <pic:blipFill>
+                    <a:blip r:embed="rId12"/>
+                    <a:stretch>
+                      <a:fillRect/>
+                    </a:stretch>
+                  </pic:blipFill>
+                  <pic:spPr>
+                    <a:xfrm>
+                      <a:off x="0" y="0"/>
+                      <a:ext cx="5257800" cy="2751357"/>
+                    </a:xfrm>
+                    <a:prstGeom prst="rect">
+                      <a:avLst/>
+                    </a:prstGeom>
+                  </pic:spPr>
+                </pic:pic>
+              </a:graphicData>
+            </a:graphic>
+          </wp:inline>
+        </w:drawing>
+      </w:r>
+    </w:p>
+    <w:p>
+      <w:r>
+        <w:t xml:space="preserve">Among the neighbors in a ¼ mile </w:t>
+      </w:r>
+      <w:r>
+        <w:t>radius</w:t>
+      </w:r>
+      <w:r>
+        <w:t xml:space="preserve"> of the transacted property, we see that </w:t>
+      </w:r>
+      <w:r>
+        <w:t xml:space="preserve">the share of privately owned property dropped, on average, by just over 1.3% with drops as high as 3.3% for transactions that are nonowner to nonowner and a low of only 0.7% for transactions that are between owners. The average share of corporate owned properties also increases across sales between an average of 0.8% and 2.7% and legally owned properties increased by about 0.6%. We can also see that there was a slight decrease in most cases of the share of </w:t>
+      </w:r>
+      <w:proofErr w:type="gramStart"/>
+      <w:r>
+        <w:t>owner occupied</w:t>
+      </w:r>
+      <w:proofErr w:type="gramEnd"/>
+      <w:r>
+        <w:t xml:space="preserve"> homes in the neighborhood and an increase in the share of owners we reside outside the </w:t>
       </w:r>
       <w:proofErr w:type="spellStart"/>
       <w:r>
-        <w:t>st_centroid</w:t>
+        <w:t>zipcode</w:t>
       </w:r>
       <w:proofErr w:type="spellEnd"/>
       <w:r>
-        <w:t xml:space="preserve">()” command that is part of the sf library for R. When then intersect these buffer areas with a map of centroids for all parcels within the county to determine what parcels are mostly located within these neighborhood definitions. </w:t>
-      </w:r>
-    </w:p>
-    <w:p>
-      <w:r>
-        <w:t xml:space="preserve">Additionally, since we accept there are several unobserved factors that will complicate the analysis, we opt to limit our data to only those properties that sold at least two times during the sample timeframe and we then link our neighborhood parcels to the ownership data for the year of sale for each of the transacted parcels. </w:t>
-      </w:r>
-    </w:p>
+        <w:t xml:space="preserve"> the transacted parcel resides in. While there are some changes in the land use profile around our transacted homes, there is not much of a change, all being less than 1% on average. </w:t>
+      </w:r>
+    </w:p>
+    <w:p>
+      <w:r>
+        <w:t xml:space="preserve">The next table shows the change in the population characteristics between the sale </w:t>
+      </w:r>
+      <w:proofErr w:type="gramStart"/>
+      <w:r>
+        <w:t>periods</w:t>
+      </w:r>
+      <w:proofErr w:type="gramEnd"/>
+      <w:r>
+        <w:t xml:space="preserve"> and the key takeaway is that there are no maj</w:t>
+      </w:r>
+      <w:r>
+        <w:t xml:space="preserve">ors population characteristics changes among the properties within the ¼ mile radius between the two to three years of the sale of property. </w:t>
+      </w:r>
+    </w:p>
+    <w:p>
+      <w:pPr>
+        <w:jc w:val="center"/>
+      </w:pPr>
+      <w:r>
+        <w:lastRenderedPageBreak/>
+        <w:drawing>
+          <wp:inline distT="0" distB="0" distL="0" distR="0" wp14:anchorId="033D9959" wp14:editId="3DBB9D26">
+            <wp:extent cx="5257800" cy="4537099"/>
+            <wp:effectExtent l="0" t="0" r="0" b="0"/>
+            <wp:docPr id="658512523" name="Picture 1"/>
+            <wp:cNvGraphicFramePr>
+              <a:graphicFrameLocks xmlns:a="http://schemas.openxmlformats.org/drawingml/2006/main" noChangeAspect="1"/>
+            </wp:cNvGraphicFramePr>
+            <a:graphic xmlns:a="http://schemas.openxmlformats.org/drawingml/2006/main">
+              <a:graphicData uri="http://schemas.openxmlformats.org/drawingml/2006/picture">
+                <pic:pic xmlns:pic="http://schemas.openxmlformats.org/drawingml/2006/picture">
+                  <pic:nvPicPr>
+                    <pic:cNvPr id="658512523" name=""/>
+                    <pic:cNvPicPr/>
+                  </pic:nvPicPr>
+                  <pic:blipFill>
+                    <a:blip r:embed="rId13"/>
+                    <a:stretch>
+                      <a:fillRect/>
+                    </a:stretch>
+                  </pic:blipFill>
+                  <pic:spPr>
+                    <a:xfrm>
+                      <a:off x="0" y="0"/>
+                      <a:ext cx="5257800" cy="4537099"/>
+                    </a:xfrm>
+                    <a:prstGeom prst="rect">
+                      <a:avLst/>
+                    </a:prstGeom>
+                  </pic:spPr>
+                </pic:pic>
+              </a:graphicData>
+            </a:graphic>
+          </wp:inline>
+        </w:drawing>
+      </w:r>
+    </w:p>
+    <w:p/>
+    <w:p/>
+    <w:p/>
+    <w:p/>
     <w:sectPr>
       <w:pgSz w:w="12240" w:h="15840"/>
       <w:pgMar w:top="1440" w:right="1440" w:bottom="1440" w:left="1440" w:header="720" w:footer="720" w:gutter="0"/>
@@ -307,6 +847,110 @@
     </w:sectPr>
   </w:body>
 </w:document>
+</file>
+
+<file path=word/endnotes.xml><?xml version="1.0" encoding="utf-8"?>
+<w:endnotes xmlns:wpc="http://schemas.microsoft.com/office/word/2010/wordprocessingCanvas" xmlns:cx="http://schemas.microsoft.com/office/drawing/2014/chartex" xmlns:cx1="http://schemas.microsoft.com/office/drawing/2015/9/8/chartex" xmlns:cx2="http://schemas.microsoft.com/office/drawing/2015/10/21/chartex" xmlns:cx3="http://schemas.microsoft.com/office/drawing/2016/5/9/chartex" xmlns:cx4="http://schemas.microsoft.com/office/drawing/2016/5/10/chartex" xmlns:cx5="http://schemas.microsoft.com/office/drawing/2016/5/11/chartex" xmlns:cx6="http://schemas.microsoft.com/office/drawing/2016/5/12/chartex" xmlns:cx7="http://schemas.microsoft.com/office/drawing/2016/5/13/chartex" xmlns:cx8="http://schemas.microsoft.com/office/drawing/2016/5/14/chartex" xmlns:mc="http://schemas.openxmlformats.org/markup-compatibility/2006" xmlns:aink="http://schemas.microsoft.com/office/drawing/2016/ink" xmlns:am3d="http://schemas.microsoft.com/office/drawing/2017/model3d" xmlns:o="urn:schemas-microsoft-com:office:office" xmlns:oel="http://schemas.microsoft.com/office/2019/extlst" xmlns:r="http://schemas.openxmlformats.org/officeDocument/2006/relationships" xmlns:m="http://schemas.openxmlformats.org/officeDocument/2006/math" xmlns:v="urn:schemas-microsoft-com:vml" xmlns:wp14="http://schemas.microsoft.com/office/word/2010/wordprocessingDrawing" xmlns:wp="http://schemas.openxmlformats.org/drawingml/2006/wordprocessingDrawing" xmlns:w10="urn:schemas-microsoft-com:office:word" xmlns:w="http://schemas.openxmlformats.org/wordprocessingml/2006/main" xmlns:w14="http://schemas.microsoft.com/office/word/2010/wordml" xmlns:w15="http://schemas.microsoft.com/office/word/2012/wordml" xmlns:w16cex="http://schemas.microsoft.com/office/word/2018/wordml/cex" xmlns:w16cid="http://schemas.microsoft.com/office/word/2016/wordml/cid" xmlns:w16="http://schemas.microsoft.com/office/word/2018/wordml" xmlns:w16du="http://schemas.microsoft.com/office/word/2023/wordml/word16du" xmlns:w16sdtdh="http://schemas.microsoft.com/office/word/2020/wordml/sdtdatahash" xmlns:w16sdtfl="http://schemas.microsoft.com/office/word/2024/wordml/sdtformatlock" xmlns:w16se="http://schemas.microsoft.com/office/word/2015/wordml/symex" xmlns:wpg="http://schemas.microsoft.com/office/word/2010/wordprocessingGroup" xmlns:wpi="http://schemas.microsoft.com/office/word/2010/wordprocessingInk" xmlns:wne="http://schemas.microsoft.com/office/word/2006/wordml" xmlns:wps="http://schemas.microsoft.com/office/word/2010/wordprocessingShape" mc:Ignorable="w14 w15 w16se w16cid w16 w16cex w16sdtdh w16sdtfl w16du wp14">
+  <w:endnote w:type="separator" w:id="-1">
+    <w:p>
+      <w:pPr>
+        <w:spacing w:after="0" w:line="240" w:lineRule="auto"/>
+      </w:pPr>
+      <w:r>
+        <w:separator/>
+      </w:r>
+    </w:p>
+  </w:endnote>
+  <w:endnote w:type="continuationSeparator" w:id="0">
+    <w:p>
+      <w:pPr>
+        <w:spacing w:after="0" w:line="240" w:lineRule="auto"/>
+      </w:pPr>
+      <w:r>
+        <w:continuationSeparator/>
+      </w:r>
+    </w:p>
+  </w:endnote>
+</w:endnotes>
+</file>
+
+<file path=word/footnotes.xml><?xml version="1.0" encoding="utf-8"?>
+<w:footnotes xmlns:wpc="http://schemas.microsoft.com/office/word/2010/wordprocessingCanvas" xmlns:cx="http://schemas.microsoft.com/office/drawing/2014/chartex" xmlns:cx1="http://schemas.microsoft.com/office/drawing/2015/9/8/chartex" xmlns:cx2="http://schemas.microsoft.com/office/drawing/2015/10/21/chartex" xmlns:cx3="http://schemas.microsoft.com/office/drawing/2016/5/9/chartex" xmlns:cx4="http://schemas.microsoft.com/office/drawing/2016/5/10/chartex" xmlns:cx5="http://schemas.microsoft.com/office/drawing/2016/5/11/chartex" xmlns:cx6="http://schemas.microsoft.com/office/drawing/2016/5/12/chartex" xmlns:cx7="http://schemas.microsoft.com/office/drawing/2016/5/13/chartex" xmlns:cx8="http://schemas.microsoft.com/office/drawing/2016/5/14/chartex" xmlns:mc="http://schemas.openxmlformats.org/markup-compatibility/2006" xmlns:aink="http://schemas.microsoft.com/office/drawing/2016/ink" xmlns:am3d="http://schemas.microsoft.com/office/drawing/2017/model3d" xmlns:o="urn:schemas-microsoft-com:office:office" xmlns:oel="http://schemas.microsoft.com/office/2019/extlst" xmlns:r="http://schemas.openxmlformats.org/officeDocument/2006/relationships" xmlns:m="http://schemas.openxmlformats.org/officeDocument/2006/math" xmlns:v="urn:schemas-microsoft-com:vml" xmlns:wp14="http://schemas.microsoft.com/office/word/2010/wordprocessingDrawing" xmlns:wp="http://schemas.openxmlformats.org/drawingml/2006/wordprocessingDrawing" xmlns:w10="urn:schemas-microsoft-com:office:word" xmlns:w="http://schemas.openxmlformats.org/wordprocessingml/2006/main" xmlns:w14="http://schemas.microsoft.com/office/word/2010/wordml" xmlns:w15="http://schemas.microsoft.com/office/word/2012/wordml" xmlns:w16cex="http://schemas.microsoft.com/office/word/2018/wordml/cex" xmlns:w16cid="http://schemas.microsoft.com/office/word/2016/wordml/cid" xmlns:w16="http://schemas.microsoft.com/office/word/2018/wordml" xmlns:w16du="http://schemas.microsoft.com/office/word/2023/wordml/word16du" xmlns:w16sdtdh="http://schemas.microsoft.com/office/word/2020/wordml/sdtdatahash" xmlns:w16sdtfl="http://schemas.microsoft.com/office/word/2024/wordml/sdtformatlock" xmlns:w16se="http://schemas.microsoft.com/office/word/2015/wordml/symex" xmlns:wpg="http://schemas.microsoft.com/office/word/2010/wordprocessingGroup" xmlns:wpi="http://schemas.microsoft.com/office/word/2010/wordprocessingInk" xmlns:wne="http://schemas.microsoft.com/office/word/2006/wordml" xmlns:wps="http://schemas.microsoft.com/office/word/2010/wordprocessingShape" mc:Ignorable="w14 w15 w16se w16cid w16 w16cex w16sdtdh w16sdtfl w16du wp14">
+  <w:footnote w:type="separator" w:id="-1">
+    <w:p>
+      <w:pPr>
+        <w:spacing w:after="0" w:line="240" w:lineRule="auto"/>
+      </w:pPr>
+      <w:r>
+        <w:separator/>
+      </w:r>
+    </w:p>
+  </w:footnote>
+  <w:footnote w:type="continuationSeparator" w:id="0">
+    <w:p>
+      <w:pPr>
+        <w:spacing w:after="0" w:line="240" w:lineRule="auto"/>
+      </w:pPr>
+      <w:r>
+        <w:continuationSeparator/>
+      </w:r>
+    </w:p>
+  </w:footnote>
+  <w:footnote w:id="1">
+    <w:p>
+      <w:pPr>
+        <w:pStyle w:val="FootnoteText"/>
+      </w:pPr>
+      <w:r>
+        <w:rPr>
+          <w:rStyle w:val="FootnoteReference"/>
+        </w:rPr>
+        <w:footnoteRef/>
+      </w:r>
+      <w:r>
+        <w:t xml:space="preserve"> </w:t>
+      </w:r>
+      <w:r>
+        <w:t>For simplicity, the buffers are center on the centroid of the sold parcel as defined by the “</w:t>
+      </w:r>
+      <w:proofErr w:type="spellStart"/>
+      <w:r>
+        <w:rPr>
+          <w:i/>
+          <w:iCs/>
+        </w:rPr>
+        <w:t>st_</w:t>
+      </w:r>
+      <w:proofErr w:type="gramStart"/>
+      <w:r>
+        <w:rPr>
+          <w:i/>
+          <w:iCs/>
+        </w:rPr>
+        <w:t>centroid</w:t>
+      </w:r>
+      <w:proofErr w:type="spellEnd"/>
+      <w:r>
+        <w:rPr>
+          <w:i/>
+          <w:iCs/>
+        </w:rPr>
+        <w:t>(</w:t>
+      </w:r>
+      <w:proofErr w:type="gramEnd"/>
+      <w:r>
+        <w:rPr>
+          <w:i/>
+          <w:iCs/>
+        </w:rPr>
+        <w:t>)</w:t>
+      </w:r>
+      <w:r>
+        <w:t>” command that is part of the sf library for R.</w:t>
+      </w:r>
+    </w:p>
+  </w:footnote>
+</w:footnotes>
 </file>
 
 <file path=word/styles.xml><?xml version="1.0" encoding="utf-8"?>
@@ -737,21 +1381,17 @@
     <w:next w:val="Normal"/>
     <w:link w:val="Heading2Char"/>
     <w:uiPriority w:val="9"/>
-    <w:semiHidden/>
     <w:unhideWhenUsed/>
     <w:qFormat/>
-    <w:rsid w:val="00762B8E"/>
+    <w:rsid w:val="00372D12"/>
     <w:pPr>
-      <w:keepNext/>
-      <w:keepLines/>
-      <w:spacing w:before="160" w:after="80"/>
       <w:outlineLvl w:val="1"/>
     </w:pPr>
     <w:rPr>
-      <w:rFonts w:asciiTheme="majorHAnsi" w:eastAsiaTheme="majorEastAsia" w:hAnsiTheme="majorHAnsi" w:cstheme="majorBidi"/>
-      <w:color w:val="0F4761" w:themeColor="accent1" w:themeShade="BF"/>
-      <w:sz w:val="32"/>
-      <w:szCs w:val="32"/>
+      <w:b/>
+      <w:bCs/>
+      <w:sz w:val="36"/>
+      <w:szCs w:val="36"/>
     </w:rPr>
   </w:style>
   <w:style w:type="paragraph" w:styleId="Heading3">
@@ -760,21 +1400,17 @@
     <w:next w:val="Normal"/>
     <w:link w:val="Heading3Char"/>
     <w:uiPriority w:val="9"/>
-    <w:semiHidden/>
     <w:unhideWhenUsed/>
     <w:qFormat/>
-    <w:rsid w:val="00762B8E"/>
+    <w:rsid w:val="00372D12"/>
     <w:pPr>
-      <w:keepNext/>
-      <w:keepLines/>
-      <w:spacing w:before="160" w:after="80"/>
       <w:outlineLvl w:val="2"/>
     </w:pPr>
     <w:rPr>
-      <w:rFonts w:eastAsiaTheme="majorEastAsia" w:cstheme="majorBidi"/>
-      <w:color w:val="0F4761" w:themeColor="accent1" w:themeShade="BF"/>
-      <w:sz w:val="28"/>
-      <w:szCs w:val="28"/>
+      <w:b/>
+      <w:bCs/>
+      <w:sz w:val="24"/>
+      <w:szCs w:val="24"/>
     </w:rPr>
   </w:style>
   <w:style w:type="paragraph" w:styleId="Heading4">
@@ -954,13 +1590,12 @@
     <w:basedOn w:val="DefaultParagraphFont"/>
     <w:link w:val="Heading2"/>
     <w:uiPriority w:val="9"/>
-    <w:semiHidden/>
-    <w:rsid w:val="00762B8E"/>
-    <w:rPr>
-      <w:rFonts w:asciiTheme="majorHAnsi" w:eastAsiaTheme="majorEastAsia" w:hAnsiTheme="majorHAnsi" w:cstheme="majorBidi"/>
-      <w:color w:val="0F4761" w:themeColor="accent1" w:themeShade="BF"/>
-      <w:sz w:val="32"/>
-      <w:szCs w:val="32"/>
+    <w:rsid w:val="00372D12"/>
+    <w:rPr>
+      <w:b/>
+      <w:bCs/>
+      <w:sz w:val="36"/>
+      <w:szCs w:val="36"/>
     </w:rPr>
   </w:style>
   <w:style w:type="character" w:customStyle="1" w:styleId="Heading3Char">
@@ -968,13 +1603,12 @@
     <w:basedOn w:val="DefaultParagraphFont"/>
     <w:link w:val="Heading3"/>
     <w:uiPriority w:val="9"/>
-    <w:semiHidden/>
-    <w:rsid w:val="00762B8E"/>
-    <w:rPr>
-      <w:rFonts w:eastAsiaTheme="majorEastAsia" w:cstheme="majorBidi"/>
-      <w:color w:val="0F4761" w:themeColor="accent1" w:themeShade="BF"/>
-      <w:sz w:val="28"/>
-      <w:szCs w:val="28"/>
+    <w:rsid w:val="00372D12"/>
+    <w:rPr>
+      <w:b/>
+      <w:bCs/>
+      <w:sz w:val="24"/>
+      <w:szCs w:val="24"/>
     </w:rPr>
   </w:style>
   <w:style w:type="character" w:customStyle="1" w:styleId="Heading4Char">
@@ -1224,6 +1858,45 @@
       <w:smallCaps/>
       <w:color w:val="0F4761" w:themeColor="accent1" w:themeShade="BF"/>
       <w:spacing w:val="5"/>
+    </w:rPr>
+  </w:style>
+  <w:style w:type="paragraph" w:styleId="FootnoteText">
+    <w:name w:val="footnote text"/>
+    <w:basedOn w:val="Normal"/>
+    <w:link w:val="FootnoteTextChar"/>
+    <w:uiPriority w:val="99"/>
+    <w:semiHidden/>
+    <w:unhideWhenUsed/>
+    <w:rsid w:val="000525B6"/>
+    <w:pPr>
+      <w:spacing w:after="0" w:line="240" w:lineRule="auto"/>
+    </w:pPr>
+    <w:rPr>
+      <w:sz w:val="20"/>
+      <w:szCs w:val="20"/>
+    </w:rPr>
+  </w:style>
+  <w:style w:type="character" w:customStyle="1" w:styleId="FootnoteTextChar">
+    <w:name w:val="Footnote Text Char"/>
+    <w:basedOn w:val="DefaultParagraphFont"/>
+    <w:link w:val="FootnoteText"/>
+    <w:uiPriority w:val="99"/>
+    <w:semiHidden/>
+    <w:rsid w:val="000525B6"/>
+    <w:rPr>
+      <w:sz w:val="20"/>
+      <w:szCs w:val="20"/>
+    </w:rPr>
+  </w:style>
+  <w:style w:type="character" w:styleId="FootnoteReference">
+    <w:name w:val="footnote reference"/>
+    <w:basedOn w:val="DefaultParagraphFont"/>
+    <w:uiPriority w:val="99"/>
+    <w:semiHidden/>
+    <w:unhideWhenUsed/>
+    <w:rsid w:val="000525B6"/>
+    <w:rPr>
+      <w:vertAlign w:val="superscript"/>
     </w:rPr>
   </w:style>
 </w:styles>
@@ -1522,4 +2195,16 @@
     </a:ext>
   </a:extLst>
 </a:theme>
+</file>
+
+<file path=customXml/item1.xml><?xml version="1.0" encoding="utf-8"?>
+<b:Sources xmlns:b="http://schemas.openxmlformats.org/officeDocument/2006/bibliography" xmlns="http://schemas.openxmlformats.org/officeDocument/2006/bibliography" SelectedStyle="\APASixthEditionOfficeOnline.xsl" StyleName="APA" Version="6"/>
+</file>
+
+<file path=customXml/itemProps1.xml><?xml version="1.0" encoding="utf-8"?>
+<ds:datastoreItem xmlns:ds="http://schemas.openxmlformats.org/officeDocument/2006/customXml" ds:itemID="{B69F0484-E84F-4E58-B00F-1C3CA0F08903}">
+  <ds:schemaRefs>
+    <ds:schemaRef ds:uri="http://schemas.openxmlformats.org/officeDocument/2006/bibliography"/>
+  </ds:schemaRefs>
+</ds:datastoreItem>
 </file>
</xml_diff>

<commit_message>
Fixed the ownership classification file along with more than 100K visual checks.
</commit_message>
<xml_diff>
--- a/Paper/Paper.docx
+++ b/Paper/Paper.docx
@@ -255,6 +255,94 @@
     <w:p>
       <w:pPr>
         <w:pStyle w:val="Heading2"/>
+      </w:pPr>
+      <w:r>
+        <w:t>Literature</w:t>
+      </w:r>
+    </w:p>
+    <w:p>
+      <w:pPr>
+        <w:rPr>
+          <w:rFonts w:ascii="Times New Roman" w:hAnsi="Times New Roman" w:cs="Times New Roman"/>
+        </w:rPr>
+      </w:pPr>
+      <w:r>
+        <w:rPr>
+          <w:rFonts w:ascii="Times New Roman" w:hAnsi="Times New Roman" w:cs="Times New Roman"/>
+        </w:rPr>
+        <w:t xml:space="preserve">Wang, et al (1991) look at the question of how rental properties impact the value of single-family residence using data from San Antonio, Texas. The paper theorizes that there are three avenues for a rental home to impact housing values radiating from the property itself to those around it. The property effect, the authors claim, is based on the idea that renters take less care with the residence than owners given their lack of stake in the upkeep of the unit. Therefore, we should expect to see rental homes sell for a loss than an owner-occupied unit. The proximity effect argues that homes closer to the rental unit should see a larger negative impact from the sale of the rental unit compared to those further away and, finally, the neighborhood effect will result in neighborhoods with a larger share of rental housing will see lower prices, overall, compared to neighborhoods with lower shares. </w:t>
+      </w:r>
+    </w:p>
+    <w:p>
+      <w:pPr>
+        <w:rPr>
+          <w:rFonts w:ascii="Times New Roman" w:hAnsi="Times New Roman" w:cs="Times New Roman"/>
+        </w:rPr>
+      </w:pPr>
+      <w:r>
+        <w:rPr>
+          <w:rFonts w:ascii="Times New Roman" w:hAnsi="Times New Roman" w:cs="Times New Roman"/>
+        </w:rPr>
+        <w:t xml:space="preserve">The estimates support this result with rental units selling at a loss of about $2,500 compared to owner-occupied units and when the impact on the five and eight nearest neighbors is estimated, the effect is larger (more negative) for the five closest properties. Finally, to show the neighborhood effect, the authors define the neighborhood as the subdivision and there is a significant negative impact with one neighborhood with sixty-five (65) percent of its housing being rental suffering a loss of nearly $26,000 compared to a neighborhood with only two (2) percent rental housing. </w:t>
+      </w:r>
+    </w:p>
+    <w:p>
+      <w:pPr>
+        <w:rPr>
+          <w:rFonts w:ascii="Times New Roman" w:hAnsi="Times New Roman" w:cs="Times New Roman"/>
+        </w:rPr>
+      </w:pPr>
+      <w:proofErr w:type="spellStart"/>
+      <w:r>
+        <w:rPr>
+          <w:rFonts w:ascii="Times New Roman" w:hAnsi="Times New Roman" w:cs="Times New Roman"/>
+        </w:rPr>
+        <w:t>Ihlandfeldt</w:t>
+      </w:r>
+      <w:proofErr w:type="spellEnd"/>
+      <w:r>
+        <w:rPr>
+          <w:rFonts w:ascii="Times New Roman" w:hAnsi="Times New Roman" w:cs="Times New Roman"/>
+        </w:rPr>
+        <w:t xml:space="preserve"> and Yang (2023) expand on this idea and look at the impact of rental housing and second homes on the resale value of owner-occupied homes in </w:t>
+      </w:r>
+      <w:r>
+        <w:rPr>
+          <w:rFonts w:ascii="Times New Roman" w:hAnsi="Times New Roman" w:cs="Times New Roman"/>
+        </w:rPr>
+        <w:t xml:space="preserve">Florida. Rather than looking at price directly, however, the authors look at the effective property tax rate and the tax price in a given area. The authors define the effective tax rate as the ratio of the property taxes paid and the market value of the home and the tax price as the ratio of the property taxes paid and the total property taxes collected. The authors argue that there are two key ways that rental or vacation homes are related to the effective tax rate (ETR). One avenue is that if these types of units increase (decrease) the expenditure required of the community more (less) than the total assessed valuation of property, then ETR must increase (decrease). Secondly, if the existence of these type of units decrease (increase) the value of existing homes in the tax base, then the ETR must increase (decrease) to compensate, all else equal. This latter effect would be most connected to the neighborhood effect outlined by Wang, et al (1991). </w:t>
+      </w:r>
+    </w:p>
+    <w:p>
+      <w:pPr>
+        <w:rPr>
+          <w:rFonts w:ascii="Times New Roman" w:hAnsi="Times New Roman" w:cs="Times New Roman"/>
+        </w:rPr>
+      </w:pPr>
+      <w:r>
+        <w:rPr>
+          <w:rFonts w:ascii="Times New Roman" w:hAnsi="Times New Roman" w:cs="Times New Roman"/>
+        </w:rPr>
+        <w:t>Dealing with tax rates, however, introduces the likelihood of endogeneity leading the authors to construct a panel of “permanent homeowners” over eleven years and to use home fixed effects. Using this method the authors argue that while changes in the city-wide share of rental homes may impact the values and tax rates, the transition of any single home will not. {ADD INFORMATION ABOUT RESULTS}</w:t>
+      </w:r>
+    </w:p>
+    <w:p>
+      <w:pPr>
+        <w:rPr>
+          <w:rFonts w:ascii="Times New Roman" w:hAnsi="Times New Roman" w:cs="Times New Roman"/>
+        </w:rPr>
+      </w:pPr>
+    </w:p>
+    <w:p>
+      <w:pPr>
+        <w:rPr>
+          <w:rFonts w:ascii="Times New Roman" w:hAnsi="Times New Roman" w:cs="Times New Roman"/>
+        </w:rPr>
+      </w:pPr>
+    </w:p>
+    <w:p>
+      <w:pPr>
+        <w:pStyle w:val="Heading2"/>
         <w:rPr>
           <w:rFonts w:ascii="Times New Roman" w:hAnsi="Times New Roman" w:cs="Times New Roman"/>
         </w:rPr>
@@ -276,6 +364,7 @@
         <w:rPr>
           <w:rFonts w:ascii="Times New Roman" w:hAnsi="Times New Roman" w:cs="Times New Roman"/>
         </w:rPr>
+        <w:lastRenderedPageBreak/>
         <w:t xml:space="preserve">The main source of data for his paper is from the Saint louis County Assessor’s office and is based on the property tax rolls for the years 2000 through 2025. This data is supplemented with data from the GIS offices within the county and the American Community Survey 5-year datasets. Further verification was carried out using the property lookup feature hosted by the Saint Louis County Assessor’s office website. </w:t>
       </w:r>
     </w:p>
@@ -781,21 +870,7 @@
         <w:rPr>
           <w:rFonts w:ascii="Times New Roman" w:hAnsi="Times New Roman" w:cs="Times New Roman"/>
         </w:rPr>
-        <w:t xml:space="preserve"> </w:t>
-      </w:r>
-      <w:proofErr w:type="gramStart"/>
-      <w:r>
-        <w:rPr>
-          <w:rFonts w:ascii="Times New Roman" w:hAnsi="Times New Roman" w:cs="Times New Roman"/>
-        </w:rPr>
-        <w:t>of</w:t>
-      </w:r>
-      <w:proofErr w:type="gramEnd"/>
-      <w:r>
-        <w:rPr>
-          <w:rFonts w:ascii="Times New Roman" w:hAnsi="Times New Roman" w:cs="Times New Roman"/>
-        </w:rPr>
-        <w:t xml:space="preserve"> the sample. What is of most interest in this figure is that the legal buyers seem to be increasing in price to almost that of private buyers while corporate buyers are not seeing </w:t>
+        <w:t xml:space="preserve"> of the sample. What is of most interest in this figure is that the legal buyers seem to be increasing in price to almost that of private buyers while corporate buyers are not seeing </w:t>
       </w:r>
       <w:r>
         <w:rPr>
@@ -833,21 +908,7 @@
         <w:rPr>
           <w:rFonts w:ascii="Times New Roman" w:hAnsi="Times New Roman" w:cs="Times New Roman"/>
         </w:rPr>
-        <w:t xml:space="preserve">utilize a repeated sales approach so that unobservable factors that are constant can be </w:t>
-      </w:r>
-      <w:proofErr w:type="gramStart"/>
-      <w:r>
-        <w:rPr>
-          <w:rFonts w:ascii="Times New Roman" w:hAnsi="Times New Roman" w:cs="Times New Roman"/>
-        </w:rPr>
-        <w:t>differenced out of</w:t>
-      </w:r>
-      <w:proofErr w:type="gramEnd"/>
-      <w:r>
-        <w:rPr>
-          <w:rFonts w:ascii="Times New Roman" w:hAnsi="Times New Roman" w:cs="Times New Roman"/>
-        </w:rPr>
-        <w:t xml:space="preserve"> the data. While this method is not perfect, it does allow us to focus on the key effects we are looking for in our analysis. Therefore, we remove any parcel that is only sold once in the data and limit the sales to those that occur with at least one year between the sales and remove any cases where the sale took place between the builder of the unit and the first owner. This results in a dataset with 34,812 observations across the period from 2012 to 2023. </w:t>
+        <w:t xml:space="preserve">utilize a repeated sales approach so that unobservable factors that are constant can be differenced out of the data. While this method is not perfect, it does allow us to focus on the key effects we are looking for in our analysis. Therefore, we remove any parcel that is only sold once in the data and limit the sales to those that occur with at least one year between the sales and remove any cases where the sale took place between the builder of the unit and the first owner. This results in a dataset with 34,812 observations across the period from 2012 to 2023. </w:t>
       </w:r>
     </w:p>
     <w:p>
@@ -922,35 +983,7 @@
         <w:rPr>
           <w:rFonts w:ascii="Times New Roman" w:hAnsi="Times New Roman" w:cs="Times New Roman"/>
         </w:rPr>
-        <w:t xml:space="preserve">There are fewer sales during 2012 and </w:t>
-      </w:r>
-      <w:proofErr w:type="gramStart"/>
-      <w:r>
-        <w:rPr>
-          <w:rFonts w:ascii="Times New Roman" w:hAnsi="Times New Roman" w:cs="Times New Roman"/>
-        </w:rPr>
-        <w:t>2013</w:t>
-      </w:r>
-      <w:proofErr w:type="gramEnd"/>
-      <w:r>
-        <w:rPr>
-          <w:rFonts w:ascii="Times New Roman" w:hAnsi="Times New Roman" w:cs="Times New Roman"/>
-        </w:rPr>
-        <w:t xml:space="preserve"> and we see that prices are generally falling for those two years. Part of this is that there is a smaller time between sales since the ownership data only </w:t>
-      </w:r>
-      <w:proofErr w:type="gramStart"/>
-      <w:r>
-        <w:rPr>
-          <w:rFonts w:ascii="Times New Roman" w:hAnsi="Times New Roman" w:cs="Times New Roman"/>
-        </w:rPr>
-        <w:t>dates back to</w:t>
-      </w:r>
-      <w:proofErr w:type="gramEnd"/>
-      <w:r>
-        <w:rPr>
-          <w:rFonts w:ascii="Times New Roman" w:hAnsi="Times New Roman" w:cs="Times New Roman"/>
-        </w:rPr>
-        <w:t xml:space="preserve"> 2011 meaning that all sales in 2012 take place within one year. We will account for this issue by estimating two samples, one with these observations and one limiting the observations to fewer years to ensure the time to sale is not driving the results. On average, the time between sales is about 3.7 years with prices generally rising across the timeframe. </w:t>
+        <w:t xml:space="preserve">There are fewer sales during 2012 and 2013 and we see that prices are generally falling for those two years. Part of this is that there is a smaller time between sales since the ownership data only dates back to 2011 meaning that all sales in 2012 take place within one year. We will account for this issue by estimating two samples, one with these observations and one limiting the observations to fewer years to ensure the time to sale is not driving the results. On average, the time between sales is about 3.7 years with prices generally rising across the timeframe. </w:t>
       </w:r>
     </w:p>
     <w:p>
@@ -1239,21 +1272,7 @@
         <w:rPr>
           <w:rFonts w:ascii="Times New Roman" w:hAnsi="Times New Roman" w:cs="Times New Roman"/>
         </w:rPr>
-        <w:t xml:space="preserve">the share of privately owned property dropped, on average, by just over 1.3% with drops as high as 3.3% for transactions that are nonowner to nonowner and a low of only 0.7% for transactions that are between owners. The average share of corporate owned properties also increases across sales between an average of 0.8% and 2.7% and legally owned properties increased by about 0.6%. We can also see that there was a slight decrease in most cases of the share of </w:t>
-      </w:r>
-      <w:proofErr w:type="gramStart"/>
-      <w:r>
-        <w:rPr>
-          <w:rFonts w:ascii="Times New Roman" w:hAnsi="Times New Roman" w:cs="Times New Roman"/>
-        </w:rPr>
-        <w:t>owner occupied</w:t>
-      </w:r>
-      <w:proofErr w:type="gramEnd"/>
-      <w:r>
-        <w:rPr>
-          <w:rFonts w:ascii="Times New Roman" w:hAnsi="Times New Roman" w:cs="Times New Roman"/>
-        </w:rPr>
-        <w:t xml:space="preserve"> homes in the neighborhood and an increase in the share of owners we reside outside the </w:t>
+        <w:t xml:space="preserve">the share of privately owned property dropped, on average, by just over 1.3% with drops as high as 3.3% for transactions that are nonowner to nonowner and a low of only 0.7% for transactions that are between owners. The average share of corporate owned properties also increases across sales between an average of 0.8% and 2.7% and legally owned properties increased by about 0.6%. We can also see that there was a slight decrease in most cases of the share of owner occupied homes in the neighborhood and an increase in the share of owners we reside outside the </w:t>
       </w:r>
       <w:proofErr w:type="spellStart"/>
       <w:r>
@@ -1280,21 +1299,7 @@
         <w:rPr>
           <w:rFonts w:ascii="Times New Roman" w:hAnsi="Times New Roman" w:cs="Times New Roman"/>
         </w:rPr>
-        <w:t xml:space="preserve">The next table shows the change in the population characteristics between the sale </w:t>
-      </w:r>
-      <w:proofErr w:type="gramStart"/>
-      <w:r>
-        <w:rPr>
-          <w:rFonts w:ascii="Times New Roman" w:hAnsi="Times New Roman" w:cs="Times New Roman"/>
-        </w:rPr>
-        <w:t>periods</w:t>
-      </w:r>
-      <w:proofErr w:type="gramEnd"/>
-      <w:r>
-        <w:rPr>
-          <w:rFonts w:ascii="Times New Roman" w:hAnsi="Times New Roman" w:cs="Times New Roman"/>
-        </w:rPr>
-        <w:t xml:space="preserve"> and the key takeaway is that there are no maj</w:t>
+        <w:t>The next table shows the change in the population characteristics between the sale periods and the key takeaway is that there are no maj</w:t>
       </w:r>
       <w:r>
         <w:rPr>
@@ -1729,13 +1734,7 @@
               <w:rPr>
                 <w:rFonts w:ascii="Times New Roman" w:hAnsi="Times New Roman" w:cs="Times New Roman"/>
               </w:rPr>
-              <w:t>[</w:t>
-            </w:r>
-            <w:r>
-              <w:rPr>
-                <w:rFonts w:ascii="Times New Roman" w:hAnsi="Times New Roman" w:cs="Times New Roman"/>
-              </w:rPr>
-              <w:t xml:space="preserve">E </w:t>
+              <w:t xml:space="preserve">[E </w:t>
             </w:r>
             <w:r>
               <w:rPr>
@@ -1822,21 +1821,7 @@
         <w:rPr>
           <w:rFonts w:ascii="Times New Roman" w:eastAsiaTheme="minorEastAsia" w:hAnsi="Times New Roman" w:cs="Times New Roman"/>
         </w:rPr>
-        <w:t xml:space="preserve"> is the constant term for all homes at </w:t>
-      </w:r>
-      <w:proofErr w:type="gramStart"/>
-      <w:r>
-        <w:rPr>
-          <w:rFonts w:ascii="Times New Roman" w:eastAsiaTheme="minorEastAsia" w:hAnsi="Times New Roman" w:cs="Times New Roman"/>
-        </w:rPr>
-        <w:t>time period</w:t>
-      </w:r>
-      <w:proofErr w:type="gramEnd"/>
-      <w:r>
-        <w:rPr>
-          <w:rFonts w:ascii="Times New Roman" w:eastAsiaTheme="minorEastAsia" w:hAnsi="Times New Roman" w:cs="Times New Roman"/>
-        </w:rPr>
-        <w:t xml:space="preserve"> </w:t>
+        <w:t xml:space="preserve"> is the constant term for all homes at time period </w:t>
       </w:r>
       <m:oMath>
         <m:r>
@@ -2641,16 +2626,8 @@
           <w:rFonts w:ascii="Times New Roman" w:eastAsiaTheme="minorEastAsia" w:hAnsi="Times New Roman" w:cs="Times New Roman"/>
         </w:rPr>
         <w:lastRenderedPageBreak/>
-        <w:t xml:space="preserve">At this point we estimate the model at three different neighborhood sizes, one-eighth of a mile, one-quarter of a mile, and one-half of a mile radius around the centroid of the parcel that is sold. We also cluster the standard errors at the census tract level, as defined by the 2020 census. {Note, in future iteration we do plan on clustering the standard errors at the tax district level as defined by the Saint Louis County Assessor’s Office to gain a close approximation of similar areas based on public goods and tax </w:t>
+        <w:t>At this point we estimate the model at three different neighborhood sizes, one-eighth of a mile, one-quarter of a mile, and one-half of a mile radius around the centroid of the parcel that is sold. We also cluster the standard errors at the census tract level, as defined by the 2020 census. {Note, in future iteration we do plan on clustering the standard errors at the tax district level as defined by the Saint Louis County Assessor’s Office to gain a close approximation of similar areas based on public goods and tax prices}.</w:t>
       </w:r>
-      <w:proofErr w:type="gramStart"/>
-      <w:r>
-        <w:rPr>
-          <w:rFonts w:ascii="Times New Roman" w:eastAsiaTheme="minorEastAsia" w:hAnsi="Times New Roman" w:cs="Times New Roman"/>
-        </w:rPr>
-        <w:t>prices}.</w:t>
-      </w:r>
-      <w:proofErr w:type="gramEnd"/>
     </w:p>
     <w:p>
       <w:pPr>
@@ -2682,21 +2659,7 @@
         <w:rPr>
           <w:rFonts w:ascii="Times New Roman" w:hAnsi="Times New Roman" w:cs="Times New Roman"/>
         </w:rPr>
-        <w:t xml:space="preserve">estimates of the model with only time fixed effects and the socioeconomic and population characteristics. We allow the year 2011 to serve as the reference category given </w:t>
-      </w:r>
-      <w:proofErr w:type="gramStart"/>
-      <w:r>
-        <w:rPr>
-          <w:rFonts w:ascii="Times New Roman" w:hAnsi="Times New Roman" w:cs="Times New Roman"/>
-        </w:rPr>
-        <w:t>the there</w:t>
-      </w:r>
-      <w:proofErr w:type="gramEnd"/>
-      <w:r>
-        <w:rPr>
-          <w:rFonts w:ascii="Times New Roman" w:hAnsi="Times New Roman" w:cs="Times New Roman"/>
-        </w:rPr>
-        <w:t xml:space="preserve"> are only homes with an initial sale in that year since we do not allow homes sold twice in the same year to be in the data sample. </w:t>
+        <w:t xml:space="preserve">estimates of the model with only time fixed effects and the socioeconomic and population characteristics. We allow the year 2011 to serve as the reference category given the there are only homes with an initial sale in that year since we do not allow homes sold twice in the same year to be in the data sample. </w:t>
       </w:r>
     </w:p>
     <w:p>
@@ -2709,35 +2672,7 @@
         <w:rPr>
           <w:rFonts w:ascii="Times New Roman" w:hAnsi="Times New Roman" w:cs="Times New Roman"/>
         </w:rPr>
-        <w:t xml:space="preserve">Most of the census characteristics are insignificant and among those that are significant, most seem to follow expectations </w:t>
-      </w:r>
-      <w:proofErr w:type="gramStart"/>
-      <w:r>
-        <w:rPr>
-          <w:rFonts w:ascii="Times New Roman" w:hAnsi="Times New Roman" w:cs="Times New Roman"/>
-        </w:rPr>
-        <w:t>with the exception of</w:t>
-      </w:r>
-      <w:proofErr w:type="gramEnd"/>
-      <w:r>
-        <w:rPr>
-          <w:rFonts w:ascii="Times New Roman" w:hAnsi="Times New Roman" w:cs="Times New Roman"/>
-        </w:rPr>
-        <w:t xml:space="preserve"> the income measure. As the median income rises, there is a slight decrease in the change in the value of the home which is opposite of what one would expect. For the percentage of white and percentage of black residents we see that as communities become more homogenous, the value of the home increases, with the racial category “other” being the reference. This gain from homogeneity does not seem to follow for the age distribution with increases in the share of the population that is sixty-five years or older show a very significant decrease in the values of a property. One concern with the socioeconomic and population characteristics results are that </w:t>
-      </w:r>
-      <w:proofErr w:type="gramStart"/>
-      <w:r>
-        <w:rPr>
-          <w:rFonts w:ascii="Times New Roman" w:hAnsi="Times New Roman" w:cs="Times New Roman"/>
-        </w:rPr>
-        <w:t>they</w:t>
-      </w:r>
-      <w:proofErr w:type="gramEnd"/>
-      <w:r>
-        <w:rPr>
-          <w:rFonts w:ascii="Times New Roman" w:hAnsi="Times New Roman" w:cs="Times New Roman"/>
-        </w:rPr>
-        <w:t xml:space="preserve"> area of census tract is simply too large to accurately reflect the neighborhood enough to be captured in the value of a home as expected.</w:t>
+        <w:t>Most of the census characteristics are insignificant and among those that are significant, most seem to follow expectations with the exception of the income measure. As the median income rises, there is a slight decrease in the change in the value of the home which is opposite of what one would expect. For the percentage of white and percentage of black residents we see that as communities become more homogenous, the value of the home increases, with the racial category “other” being the reference. This gain from homogeneity does not seem to follow for the age distribution with increases in the share of the population that is sixty-five years or older show a very significant decrease in the values of a property. One concern with the socioeconomic and population characteristics results are that they area of census tract is simply too large to accurately reflect the neighborhood enough to be captured in the value of a home as expected.</w:t>
       </w:r>
     </w:p>
     <w:tbl>
@@ -8491,21 +8426,7 @@
         <w:rPr>
           <w:rFonts w:ascii="Times New Roman" w:hAnsi="Times New Roman" w:cs="Times New Roman"/>
         </w:rPr>
-        <w:t xml:space="preserve"> the surrounding properties, a one percent increase in the share of the neighbors of a home that </w:t>
-      </w:r>
-      <w:proofErr w:type="gramStart"/>
-      <w:r>
-        <w:rPr>
-          <w:rFonts w:ascii="Times New Roman" w:hAnsi="Times New Roman" w:cs="Times New Roman"/>
-        </w:rPr>
-        <w:t>are</w:t>
-      </w:r>
-      <w:proofErr w:type="gramEnd"/>
-      <w:r>
-        <w:rPr>
-          <w:rFonts w:ascii="Times New Roman" w:hAnsi="Times New Roman" w:cs="Times New Roman"/>
-        </w:rPr>
-        <w:t xml:space="preserve"> owned by corporate owners </w:t>
+        <w:t xml:space="preserve"> the surrounding properties, a one percent increase in the share of the neighbors of a home that are owned by corporate owners </w:t>
       </w:r>
       <w:r>
         <w:rPr>
@@ -16937,31 +16858,7 @@
         <w:t xml:space="preserve">Tables five, six and seven expand the size of the neighborhood to those properties located within one-quarter of a mile from the centroid of the parcel being sold. </w:t>
       </w:r>
       <w:r>
-        <w:t xml:space="preserve">We do see a slight increase in the premium when the share of neighbors within this larger radius </w:t>
-      </w:r>
-      <w:proofErr w:type="gramStart"/>
-      <w:r>
-        <w:t>are</w:t>
-      </w:r>
-      <w:proofErr w:type="gramEnd"/>
-      <w:r>
-        <w:t xml:space="preserve"> owned by agents classified as corporate owners with a premium of about 6% and, as before, </w:t>
-      </w:r>
-      <w:proofErr w:type="gramStart"/>
-      <w:r>
-        <w:t>the</w:t>
-      </w:r>
-      <w:proofErr w:type="gramEnd"/>
-      <w:r>
-        <w:t xml:space="preserve"> </w:t>
-      </w:r>
-      <w:proofErr w:type="gramStart"/>
-      <w:r>
-        <w:t>is</w:t>
-      </w:r>
-      <w:proofErr w:type="gramEnd"/>
-      <w:r>
-        <w:t xml:space="preserve"> enjoyed purely by those units sold to owner-occupiers. Also, as before, changes in the ownership of the neighbors by private or legal agents have no statistical impact on the sale price and, in the larger neighborhood radius, neither does a change in the share of “other” agent types. </w:t>
+        <w:t xml:space="preserve">We do see a slight increase in the premium when the share of neighbors within this larger radius are owned by agents classified as corporate owners with a premium of about 6% and, as before, the is enjoyed purely by those units sold to owner-occupiers. Also, as before, changes in the ownership of the neighbors by private or legal agents have no statistical impact on the sale price and, in the larger neighborhood radius, neither does a change in the share of “other” agent types. </w:t>
       </w:r>
     </w:p>
     <w:tbl>
@@ -25176,6 +25073,84 @@
         </w:tc>
       </w:tr>
     </w:tbl>
+    <w:p>
+      <w:pPr>
+        <w:rPr>
+          <w:rFonts w:ascii="Times New Roman" w:hAnsi="Times New Roman" w:cs="Times New Roman"/>
+        </w:rPr>
+      </w:pPr>
+    </w:p>
+    <w:p>
+      <w:pPr>
+        <w:rPr>
+          <w:rFonts w:ascii="Times New Roman" w:hAnsi="Times New Roman" w:cs="Times New Roman"/>
+        </w:rPr>
+      </w:pPr>
+    </w:p>
+    <w:p>
+      <w:pPr>
+        <w:pStyle w:val="Heading2"/>
+      </w:pPr>
+      <w:r>
+        <w:t>References</w:t>
+      </w:r>
+    </w:p>
+    <w:p>
+      <w:pPr>
+        <w:ind w:left="360" w:hanging="360"/>
+        <w:rPr>
+          <w:rFonts w:ascii="Times New Roman" w:hAnsi="Times New Roman" w:cs="Times New Roman"/>
+        </w:rPr>
+      </w:pPr>
+      <w:r>
+        <w:rPr>
+          <w:rFonts w:ascii="Times New Roman" w:hAnsi="Times New Roman" w:cs="Times New Roman"/>
+        </w:rPr>
+        <w:t>Ihlanfeldt, K., &amp; Yang, C. F. (2023). Are the home values and property tax burdens of permanent homeowners affected by growth in housing rentals and second homes: Evidence based on big data from Florida. </w:t>
+      </w:r>
+      <w:r>
+        <w:rPr>
+          <w:rFonts w:ascii="Times New Roman" w:hAnsi="Times New Roman" w:cs="Times New Roman"/>
+          <w:i/>
+          <w:iCs/>
+        </w:rPr>
+        <w:t>Journal of Regional Science</w:t>
+      </w:r>
+      <w:r>
+        <w:rPr>
+          <w:rFonts w:ascii="Times New Roman" w:hAnsi="Times New Roman" w:cs="Times New Roman"/>
+        </w:rPr>
+        <w:t>, </w:t>
+      </w:r>
+      <w:r>
+        <w:rPr>
+          <w:rFonts w:ascii="Times New Roman" w:hAnsi="Times New Roman" w:cs="Times New Roman"/>
+          <w:i/>
+          <w:iCs/>
+        </w:rPr>
+        <w:t>63</w:t>
+      </w:r>
+      <w:r>
+        <w:rPr>
+          <w:rFonts w:ascii="Times New Roman" w:hAnsi="Times New Roman" w:cs="Times New Roman"/>
+        </w:rPr>
+        <w:t>(2), 470–502.</w:t>
+      </w:r>
+    </w:p>
+    <w:p>
+      <w:pPr>
+        <w:ind w:left="360" w:hanging="360"/>
+        <w:rPr>
+          <w:rFonts w:ascii="Times New Roman" w:hAnsi="Times New Roman" w:cs="Times New Roman"/>
+        </w:rPr>
+      </w:pPr>
+      <w:r>
+        <w:rPr>
+          <w:rFonts w:ascii="Times New Roman" w:hAnsi="Times New Roman" w:cs="Times New Roman"/>
+        </w:rPr>
+        <w:t>Wang, K., Grissom, T. V., Webb, J. R., &amp; Spellman, L. (1991). The impact of rental properties on the value of single-family residences. Journal of Urban Economics, 30(2), 152–166.</w:t>
+      </w:r>
+    </w:p>
     <w:p>
       <w:pPr>
         <w:rPr>
@@ -25271,37 +25246,12 @@
       <w:r>
         <w:t>For simplicity, the buffers are center on the centroid of the sold parcel as defined by the “</w:t>
       </w:r>
-      <w:proofErr w:type="spellStart"/>
       <w:r>
         <w:rPr>
           <w:i/>
           <w:iCs/>
         </w:rPr>
-        <w:t>st_</w:t>
-      </w:r>
-      <w:proofErr w:type="gramStart"/>
-      <w:r>
-        <w:rPr>
-          <w:i/>
-          <w:iCs/>
-        </w:rPr>
-        <w:t>centroid</w:t>
-      </w:r>
-      <w:proofErr w:type="spellEnd"/>
-      <w:r>
-        <w:rPr>
-          <w:i/>
-          <w:iCs/>
-        </w:rPr>
-        <w:t>(</w:t>
-      </w:r>
-      <w:proofErr w:type="gramEnd"/>
-      <w:r>
-        <w:rPr>
-          <w:i/>
-          <w:iCs/>
-        </w:rPr>
-        <w:t>)</w:t>
+        <w:t>st_centroid()</w:t>
       </w:r>
       <w:r>
         <w:t>” command that is part of the sf library for R.</w:t>
@@ -25906,7 +25856,6 @@
   <w:style w:type="character" w:default="1" w:styleId="DefaultParagraphFont">
     <w:name w:val="Default Paragraph Font"/>
     <w:uiPriority w:val="1"/>
-    <w:semiHidden/>
     <w:unhideWhenUsed/>
   </w:style>
   <w:style w:type="table" w:default="1" w:styleId="TableNormal">

</xml_diff>